<commit_message>
ottimizzazione per scarsa connessione
</commit_message>
<xml_diff>
--- a/Piano di Sviluppo.docx
+++ b/Piano di Sviluppo.docx
@@ -30,7 +30,7 @@
     <w:p>
       <w:r>
         <w:pict w14:anchorId="4DA14348">
-          <v:rect id="_x0000_i1107" style="width:0;height:1.5pt" o:hralign="center" o:hrstd="t" o:hr="t" fillcolor="#a0a0a0" stroked="f"/>
+          <v:rect id="_x0000_i1025" style="width:0;height:1.5pt" o:hralign="center" o:hrstd="t" o:hr="t" fillcolor="#a0a0a0" stroked="f"/>
         </w:pict>
       </w:r>
     </w:p>
@@ -120,7 +120,7 @@
     <w:p>
       <w:r>
         <w:pict w14:anchorId="3E9F0124">
-          <v:rect id="_x0000_i1108" style="width:0;height:1.5pt" o:hralign="center" o:hrstd="t" o:hr="t" fillcolor="#a0a0a0" stroked="f"/>
+          <v:rect id="_x0000_i1026" style="width:0;height:1.5pt" o:hralign="center" o:hrstd="t" o:hr="t" fillcolor="#a0a0a0" stroked="f"/>
         </w:pict>
       </w:r>
     </w:p>
@@ -452,7 +452,7 @@
     <w:p>
       <w:r>
         <w:pict w14:anchorId="74FB8FB3">
-          <v:rect id="_x0000_i1109" style="width:0;height:1.5pt" o:hralign="center" o:hrstd="t" o:hr="t" fillcolor="#a0a0a0" stroked="f"/>
+          <v:rect id="_x0000_i1027" style="width:0;height:1.5pt" o:hralign="center" o:hrstd="t" o:hr="t" fillcolor="#a0a0a0" stroked="f"/>
         </w:pict>
       </w:r>
     </w:p>
@@ -962,7 +962,7 @@
     <w:p>
       <w:r>
         <w:pict w14:anchorId="71C4CD1F">
-          <v:rect id="_x0000_i1110" style="width:0;height:1.5pt" o:hralign="center" o:hrstd="t" o:hr="t" fillcolor="#a0a0a0" stroked="f"/>
+          <v:rect id="_x0000_i1028" style="width:0;height:1.5pt" o:hralign="center" o:hrstd="t" o:hr="t" fillcolor="#a0a0a0" stroked="f"/>
         </w:pict>
       </w:r>
     </w:p>
@@ -1030,6 +1030,11 @@
     <w:p>
       <w:r>
         <w:lastRenderedPageBreak/>
+        <w:t xml:space="preserve">    </w:t>
+      </w:r>
+    </w:p>
+    <w:p>
+      <w:r>
         <w:t xml:space="preserve">    match /users/{</w:t>
       </w:r>
       <w:proofErr w:type="spellStart"/>
@@ -1128,6 +1133,7 @@
         <w:t xml:space="preserve">    }</w:t>
       </w:r>
     </w:p>
+    <w:p/>
     <w:p>
       <w:r>
         <w:t xml:space="preserve">    match /events/{</w:t>
@@ -1265,6 +1271,7 @@
         <w:t xml:space="preserve">    }</w:t>
       </w:r>
     </w:p>
+    <w:p/>
     <w:p>
       <w:r>
         <w:t xml:space="preserve">    match /events/{</w:t>
@@ -1288,7 +1295,7 @@
     </w:p>
     <w:p>
       <w:r>
-        <w:t xml:space="preserve">      </w:t>
+        <w:t xml:space="preserve">        </w:t>
       </w:r>
       <w:proofErr w:type="spellStart"/>
       <w:r>
@@ -1325,7 +1332,7 @@
     </w:p>
     <w:p>
       <w:r>
-        <w:t xml:space="preserve">                     </w:t>
+        <w:t xml:space="preserve">                       </w:t>
       </w:r>
       <w:proofErr w:type="spellStart"/>
       <w:r>
@@ -1346,7 +1353,7 @@
     </w:p>
     <w:p>
       <w:r>
-        <w:t xml:space="preserve">      </w:t>
+        <w:t xml:space="preserve">        </w:t>
       </w:r>
       <w:proofErr w:type="spellStart"/>
       <w:r>
@@ -1386,12 +1393,12 @@
       </w:r>
       <w:proofErr w:type="spellEnd"/>
       <w:r>
-        <w:t xml:space="preserve"> ||</w:t>
-      </w:r>
-    </w:p>
-    <w:p>
-      <w:r>
-        <w:t xml:space="preserve">                      </w:t>
+        <w:t xml:space="preserve"> || </w:t>
+      </w:r>
+    </w:p>
+    <w:p>
+      <w:r>
+        <w:t xml:space="preserve">                        </w:t>
       </w:r>
       <w:proofErr w:type="spellStart"/>
       <w:r>
@@ -1409,6 +1416,11 @@
     </w:p>
     <w:p>
       <w:r>
+        <w:t xml:space="preserve">    </w:t>
+      </w:r>
+    </w:p>
+    <w:p>
+      <w:r>
         <w:t xml:space="preserve">    match /events/{</w:t>
       </w:r>
       <w:proofErr w:type="spellStart"/>
@@ -1430,7 +1442,7 @@
     </w:p>
     <w:p>
       <w:r>
-        <w:t xml:space="preserve">      </w:t>
+        <w:t xml:space="preserve">        </w:t>
       </w:r>
       <w:proofErr w:type="spellStart"/>
       <w:r>
@@ -1475,7 +1487,7 @@
     </w:p>
     <w:p>
       <w:r>
-        <w:t xml:space="preserve">      </w:t>
+        <w:t xml:space="preserve">        </w:t>
       </w:r>
       <w:proofErr w:type="spellStart"/>
       <w:r>
@@ -1515,6 +1527,7 @@
         <w:t xml:space="preserve">    }</w:t>
       </w:r>
     </w:p>
+    <w:p/>
     <w:p>
       <w:r>
         <w:t xml:space="preserve">    match /events/{</w:t>
@@ -1538,7 +1551,7 @@
     </w:p>
     <w:p>
       <w:r>
-        <w:t xml:space="preserve">      </w:t>
+        <w:t xml:space="preserve">        </w:t>
       </w:r>
       <w:proofErr w:type="spellStart"/>
       <w:r>
@@ -1575,7 +1588,7 @@
     </w:p>
     <w:p>
       <w:r>
-        <w:t xml:space="preserve">      </w:t>
+        <w:t xml:space="preserve">        </w:t>
       </w:r>
       <w:proofErr w:type="spellStart"/>
       <w:r>
@@ -1615,8 +1628,10 @@
         <w:t xml:space="preserve">    }</w:t>
       </w:r>
     </w:p>
-    <w:p>
-      <w:r>
+    <w:p/>
+    <w:p>
+      <w:r>
+        <w:lastRenderedPageBreak/>
         <w:t xml:space="preserve">    match /events/{</w:t>
       </w:r>
       <w:proofErr w:type="spellStart"/>
@@ -1646,7 +1661,7 @@
     </w:p>
     <w:p>
       <w:r>
-        <w:t xml:space="preserve">      </w:t>
+        <w:t xml:space="preserve">        </w:t>
       </w:r>
       <w:proofErr w:type="spellStart"/>
       <w:r>
@@ -1678,12 +1693,12 @@
       </w:r>
       <w:proofErr w:type="spellEnd"/>
       <w:r>
-        <w:t xml:space="preserve"> == get(/databases/$(database)/documents/events/$(eventId)).data.organizerId</w:t>
-      </w:r>
-    </w:p>
-    <w:p>
-      <w:r>
-        <w:t xml:space="preserve">                    || </w:t>
+        <w:t xml:space="preserve"> == get(/databases/$(database)/documents/events/$(eventId)).data.organizerId </w:t>
+      </w:r>
+    </w:p>
+    <w:p>
+      <w:r>
+        <w:t xml:space="preserve">                      || </w:t>
       </w:r>
       <w:proofErr w:type="spellStart"/>
       <w:r>
@@ -1704,7 +1719,12 @@
     </w:p>
     <w:p>
       <w:r>
-        <w:t xml:space="preserve">      </w:t>
+        <w:t xml:space="preserve">        </w:t>
+      </w:r>
+    </w:p>
+    <w:p>
+      <w:r>
+        <w:t xml:space="preserve">        </w:t>
       </w:r>
       <w:proofErr w:type="spellStart"/>
       <w:r>
@@ -1736,12 +1756,7 @@
       </w:r>
       <w:proofErr w:type="spellEnd"/>
       <w:r>
-        <w:t xml:space="preserve"> &amp;&amp;</w:t>
-      </w:r>
-    </w:p>
-    <w:p>
-      <w:r>
-        <w:t xml:space="preserve">                       get(/databases/$(database)/documents/events/$(eventId)).data.status == '</w:t>
+        <w:t xml:space="preserve"> &amp;&amp; get(/databases/$(database)/documents/events/$(eventId)).data.status == '</w:t>
       </w:r>
       <w:proofErr w:type="spellStart"/>
       <w:r>
@@ -1752,10 +1767,10 @@
         <w:t>';</w:t>
       </w:r>
     </w:p>
-    <w:p>
-      <w:r>
-        <w:lastRenderedPageBreak/>
-        <w:t xml:space="preserve">      </w:t>
+    <w:p/>
+    <w:p>
+      <w:r>
+        <w:t xml:space="preserve">        </w:t>
       </w:r>
       <w:proofErr w:type="spellStart"/>
       <w:r>
@@ -1782,9 +1797,10 @@
         <w:t xml:space="preserve"> == get(/databases/$(database)/documents/events/$(eventId)).data.organizerId;</w:t>
       </w:r>
     </w:p>
-    <w:p>
-      <w:r>
-        <w:t xml:space="preserve">      </w:t>
+    <w:p/>
+    <w:p>
+      <w:r>
+        <w:t xml:space="preserve">        </w:t>
       </w:r>
       <w:proofErr w:type="spellStart"/>
       <w:r>
@@ -1816,12 +1832,7 @@
       </w:r>
       <w:proofErr w:type="spellEnd"/>
       <w:r>
-        <w:t xml:space="preserve"> &amp;&amp;</w:t>
-      </w:r>
-    </w:p>
-    <w:p>
-      <w:r>
-        <w:t xml:space="preserve">                        get(/databases/$(database)/documents/events/$(eventId)).data.status == '</w:t>
+        <w:t xml:space="preserve"> &amp;&amp; get(/databases/$(database)/documents/events/$(eventId)).data.status == '</w:t>
       </w:r>
       <w:proofErr w:type="spellStart"/>
       <w:r>
@@ -1834,7 +1845,7 @@
     </w:p>
     <w:p>
       <w:r>
-        <w:t xml:space="preserve">                       (</w:t>
+        <w:t xml:space="preserve">                         (</w:t>
       </w:r>
       <w:proofErr w:type="spellStart"/>
       <w:r>
@@ -1850,6 +1861,7 @@
         <w:t xml:space="preserve">    }</w:t>
       </w:r>
     </w:p>
+    <w:p/>
     <w:p>
       <w:r>
         <w:t xml:space="preserve">    match /events/{</w:t>
@@ -1881,7 +1893,7 @@
     </w:p>
     <w:p>
       <w:r>
-        <w:t xml:space="preserve">      </w:t>
+        <w:t xml:space="preserve">        </w:t>
       </w:r>
       <w:proofErr w:type="spellStart"/>
       <w:r>
@@ -1929,12 +1941,12 @@
       </w:r>
       <w:proofErr w:type="spellEnd"/>
       <w:r>
-        <w:t xml:space="preserve"> ||</w:t>
-      </w:r>
-    </w:p>
-    <w:p>
-      <w:r>
-        <w:t xml:space="preserve">                            </w:t>
+        <w:t xml:space="preserve"> || </w:t>
+      </w:r>
+    </w:p>
+    <w:p>
+      <w:r>
+        <w:t xml:space="preserve">                              </w:t>
       </w:r>
       <w:proofErr w:type="spellStart"/>
       <w:r>
@@ -1959,11 +1971,9 @@
       <w:r>
         <w:t>}</w:t>
       </w:r>
-    </w:p>
-    <w:p>
       <w:r>
         <w:pict w14:anchorId="25FE0B49">
-          <v:rect id="_x0000_i1111" style="width:0;height:1.5pt" o:hralign="center" o:hrstd="t" o:hr="t" fillcolor="#a0a0a0" stroked="f"/>
+          <v:rect id="_x0000_i1029" style="width:0;height:1.5pt" o:hralign="center" o:hrstd="t" o:hr="t" fillcolor="#a0a0a0" stroked="f"/>
         </w:pict>
       </w:r>
     </w:p>
@@ -2220,6 +2230,7 @@
         </w:numPr>
       </w:pPr>
       <w:r>
+        <w:lastRenderedPageBreak/>
         <w:t xml:space="preserve">Aggiunta schermata </w:t>
       </w:r>
       <w:proofErr w:type="spellStart"/>
@@ -2428,7 +2439,6 @@
       </w:pPr>
       <w:proofErr w:type="spellStart"/>
       <w:r>
-        <w:lastRenderedPageBreak/>
         <w:t>teamStats</w:t>
       </w:r>
       <w:proofErr w:type="spellEnd"/>
@@ -2886,7 +2896,7 @@
     <w:p>
       <w:r>
         <w:pict w14:anchorId="1E03AE16">
-          <v:rect id="_x0000_i1112" style="width:0;height:1.5pt" o:hralign="center" o:hrstd="t" o:hr="t" fillcolor="#a0a0a0" stroked="f"/>
+          <v:rect id="_x0000_i1030" style="width:0;height:1.5pt" o:hralign="center" o:hrstd="t" o:hr="t" fillcolor="#a0a0a0" stroked="f"/>
         </w:pict>
       </w:r>
     </w:p>
@@ -2907,6 +2917,7 @@
         </w:numPr>
       </w:pPr>
       <w:r>
+        <w:lastRenderedPageBreak/>
         <w:t>Aprire una chat per fase. Allegare sempre il codice aggiornato (non l'originale) e questo documento.</w:t>
       </w:r>
     </w:p>
@@ -2962,7 +2973,7 @@
     <w:p>
       <w:r>
         <w:pict w14:anchorId="0E3A4F2C">
-          <v:rect id="_x0000_i1113" style="width:0;height:1.5pt" o:hralign="center" o:hrstd="t" o:hr="t" fillcolor="#a0a0a0" stroked="f"/>
+          <v:rect id="_x0000_i1031" style="width:0;height:1.5pt" o:hralign="center" o:hrstd="t" o:hr="t" fillcolor="#a0a0a0" stroked="f"/>
         </w:pict>
       </w:r>
     </w:p>
@@ -8043,6 +8054,7 @@
   <w:style w:type="character" w:default="1" w:styleId="Carpredefinitoparagrafo">
     <w:name w:val="Default Paragraph Font"/>
     <w:uiPriority w:val="1"/>
+    <w:semiHidden/>
     <w:unhideWhenUsed/>
   </w:style>
   <w:style w:type="table" w:default="1" w:styleId="Tabellanormale">

</xml_diff>